<commit_message>
docs: sync docs/ with security hardening changes
- architecture.md: AAD v2 role binding, fsync + .safepass.bak + VAULT_WRITE_LOCK,
  backend autolock (enforce_autolock), Hello passport-blob, FIRST_PIPE_INSTANCE,
  eTLD+1 scoring, KDF param validation, Zeroizing api token, logging, threat model
- tech-stack.md: same facts for module/command/tool tables (40+greet commands,
  vitest + CI workflows, secureStorage/safeExternalUrl, storage table, ch.8 updates);
  tech-stack.docx regenerated via pandoc (as docs-build.yml does)
- USER-GUIDE.md: backend autolock note, vault integrity section (.bak, AAD,
  encrypted attachments, scheme whitelist), extension domain-matching explanation
</commit_message>
<xml_diff>
--- a/docs/tech-stack.docx
+++ b/docs/tech-stack.docx
@@ -2,14 +2,6 @@
 <file path=word/document.xml><?xml version="1.0" encoding="utf-8"?>
 <w:document xmlns:w="http://schemas.openxmlformats.org/wordprocessingml/2006/main" xmlns:m="http://schemas.openxmlformats.org/officeDocument/2006/math" xmlns:r="http://schemas.openxmlformats.org/officeDocument/2006/relationships" xmlns:o="urn:schemas-microsoft-com:office:office" xmlns:v="urn:schemas-microsoft-com:vml" xmlns:w10="urn:schemas-microsoft-com:office:word" xmlns:a="http://schemas.openxmlformats.org/drawingml/2006/main" xmlns:pic="http://schemas.openxmlformats.org/drawingml/2006/picture" xmlns:wp="http://schemas.openxmlformats.org/drawingml/2006/wordprocessingDrawing">
   <w:body>
-    <w:p>
-      <w:pPr>
-        <w:pStyle w:val="Title"/>
-      </w:pPr>
-      <w:r>
-        <w:t xml:space="preserve">Mynx — Стек и технологии</w:t>
-      </w:r>
-    </w:p>
     <w:bookmarkStart w:id="40" w:name="mynx--стек-и-технологии"/>
     <w:p>
       <w:pPr>
@@ -358,7 +350,7 @@
         <w:rPr>
           <w:rStyle w:val="VerbatimChar"/>
         </w:rPr>
-        <w:t xml:space="preserve">  ├── WebView (React UI) ⇄ Tauri commands (Rust, ~40 команд)</w:t>
+        <w:t xml:space="preserve">  ├── WebView (React UI) ⇄ Tauri commands (Rust, 40 команд + greet)</w:t>
       </w:r>
       <w:r>
         <w:br/>
@@ -939,7 +931,19 @@
               <w:t xml:space="preserve"> </w:t>
             </w:r>
             <w:r>
-              <w:t xml:space="preserve">в localStorage для настроек/категорий/вложений</w:t>
+              <w:t xml:space="preserve">в localStorage для настроек/категорий/вложений (вложения — через шифрованный снапшот, см.</w:t>
+            </w:r>
+            <w:r>
+              <w:t xml:space="preserve"> </w:t>
+            </w:r>
+            <w:r>
+              <w:rPr>
+                <w:rStyle w:val="VerbatimChar"/>
+              </w:rPr>
+              <w:t xml:space="preserve">secureStorage.ts</w:t>
+            </w:r>
+            <w:r>
+              <w:t xml:space="preserve">)</w:t>
             </w:r>
           </w:p>
         </w:tc>
@@ -1338,7 +1342,10 @@
         <w:t xml:space="preserve">mynx-attachments</w:t>
       </w:r>
       <w:r>
-        <w:t xml:space="preserve">; язык —</w:t>
+        <w:t xml:space="preserve"> </w:t>
+      </w:r>
+      <w:r>
+        <w:t xml:space="preserve">(шифрованный), язык —</w:t>
       </w:r>
       <w:r>
         <w:t xml:space="preserve"> </w:t>
@@ -1351,6 +1358,119 @@
       </w:r>
       <w:r>
         <w:t xml:space="preserve">.</w:t>
+      </w:r>
+    </w:p>
+    <w:p>
+      <w:pPr>
+        <w:pStyle w:val="Compact"/>
+        <w:numPr>
+          <w:ilvl w:val="0"/>
+          <w:numId w:val="1001"/>
+        </w:numPr>
+      </w:pPr>
+      <w:r>
+        <w:rPr>
+          <w:b/>
+          <w:bCs/>
+        </w:rPr>
+        <w:t xml:space="preserve">Шифрование локального стора</w:t>
+      </w:r>
+      <w:r>
+        <w:t xml:space="preserve"> </w:t>
+      </w:r>
+      <w:r>
+        <w:t xml:space="preserve">(</w:t>
+      </w:r>
+      <w:r>
+        <w:rPr>
+          <w:rStyle w:val="VerbatimChar"/>
+        </w:rPr>
+        <w:t xml:space="preserve">src/lib/secureStorage.ts</w:t>
+      </w:r>
+      <w:r>
+        <w:t xml:space="preserve">): снапшот zustand-персиста вложений шифруется AES-256-GCM (WebCrypto), ключ — неэкспортируемый</w:t>
+      </w:r>
+      <w:r>
+        <w:t xml:space="preserve"> </w:t>
+      </w:r>
+      <w:r>
+        <w:rPr>
+          <w:rStyle w:val="VerbatimChar"/>
+        </w:rPr>
+        <w:t xml:space="preserve">CryptoKey</w:t>
+      </w:r>
+      <w:r>
+        <w:t xml:space="preserve"> </w:t>
+      </w:r>
+      <w:r>
+        <w:t xml:space="preserve">в IndexedDB; формат в localStorage —</w:t>
+      </w:r>
+      <w:r>
+        <w:t xml:space="preserve"> </w:t>
+      </w:r>
+      <w:r>
+        <w:rPr>
+          <w:rStyle w:val="VerbatimChar"/>
+        </w:rPr>
+        <w:t xml:space="preserve">{"mynx-enc-v1":true,"iv","ct"}</w:t>
+      </w:r>
+      <w:r>
+        <w:t xml:space="preserve">; миграция с plaintext при первом чтении; потеря ключа (очищенная IndexedDB) — снапшот пересоздаётся.</w:t>
+      </w:r>
+    </w:p>
+    <w:p>
+      <w:pPr>
+        <w:pStyle w:val="Compact"/>
+        <w:numPr>
+          <w:ilvl w:val="0"/>
+          <w:numId w:val="1001"/>
+        </w:numPr>
+      </w:pPr>
+      <w:r>
+        <w:rPr>
+          <w:b/>
+          <w:bCs/>
+        </w:rPr>
+        <w:t xml:space="preserve">Внешние ссылки</w:t>
+      </w:r>
+      <w:r>
+        <w:t xml:space="preserve"> </w:t>
+      </w:r>
+      <w:r>
+        <w:t xml:space="preserve">(</w:t>
+      </w:r>
+      <w:r>
+        <w:rPr>
+          <w:rStyle w:val="VerbatimChar"/>
+        </w:rPr>
+        <w:t xml:space="preserve">src/lib/utils.ts::safeExternalUrl</w:t>
+      </w:r>
+      <w:r>
+        <w:t xml:space="preserve">): открытие записи допускает только http/https; домены без схемы поднимаются до https,</w:t>
+      </w:r>
+      <w:r>
+        <w:t xml:space="preserve"> </w:t>
+      </w:r>
+      <w:r>
+        <w:rPr>
+          <w:rStyle w:val="VerbatimChar"/>
+        </w:rPr>
+        <w:t xml:space="preserve">javascript:</w:t>
+      </w:r>
+      <w:r>
+        <w:t xml:space="preserve">/</w:t>
+      </w:r>
+      <w:r>
+        <w:rPr>
+          <w:rStyle w:val="VerbatimChar"/>
+        </w:rPr>
+        <w:t xml:space="preserve">data:</w:t>
+      </w:r>
+      <w:r>
+        <w:t xml:space="preserve"> </w:t>
+      </w:r>
+      <w:r>
+        <w:t xml:space="preserve">и прочие схемы → null (кнопка скрыта). Покрыто vitest-тестами.</w:t>
       </w:r>
     </w:p>
     <w:p>
@@ -2379,7 +2499,28 @@
         <w:t xml:space="preserve"> </w:t>
       </w:r>
       <w:r>
-        <w:t xml:space="preserve">(сессия vault, API-токен, device key, ключи pairing IPC, защищённый буфер, счётчики rate-limit) за</w:t>
+        <w:t xml:space="preserve">(сессия vault, API-токен, device key, ключи pairing IPC, защищённый буфер, счётчики rate-limit,</w:t>
+      </w:r>
+      <w:r>
+        <w:t xml:space="preserve"> </w:t>
+      </w:r>
+      <w:r>
+        <w:rPr>
+          <w:rStyle w:val="VerbatimChar"/>
+        </w:rPr>
+        <w:t xml:space="preserve">last_activity</w:t>
+      </w:r>
+      <w:r>
+        <w:t xml:space="preserve">/</w:t>
+      </w:r>
+      <w:r>
+        <w:rPr>
+          <w:rStyle w:val="VerbatimChar"/>
+        </w:rPr>
+        <w:t xml:space="preserve">autolock_minutes</w:t>
+      </w:r>
+      <w:r>
+        <w:t xml:space="preserve">) за</w:t>
       </w:r>
       <w:r>
         <w:t xml:space="preserve"> </w:t>
@@ -2392,6 +2533,36 @@
       </w:r>
       <w:r>
         <w:t xml:space="preserve">.</w:t>
+      </w:r>
+      <w:r>
+        <w:t xml:space="preserve"> </w:t>
+      </w:r>
+      <w:r>
+        <w:rPr>
+          <w:rStyle w:val="VerbatimChar"/>
+        </w:rPr>
+        <w:t xml:space="preserve">enforce_autolock()</w:t>
+      </w:r>
+      <w:r>
+        <w:t xml:space="preserve"> </w:t>
+      </w:r>
+      <w:r>
+        <w:t xml:space="preserve">вызывается на каждом секрет-команде: при простое дольше лимита сессия затирается, возвращается</w:t>
+      </w:r>
+      <w:r>
+        <w:t xml:space="preserve"> </w:t>
+      </w:r>
+      <w:r>
+        <w:rPr>
+          <w:rStyle w:val="VerbatimChar"/>
+        </w:rPr>
+        <w:t xml:space="preserve">vault_locked</w:t>
+      </w:r>
+      <w:r>
+        <w:t xml:space="preserve"> </w:t>
+      </w:r>
+      <w:r>
+        <w:t xml:space="preserve">(бэкенд-дубль фронтенд-таймера — обход фронтенда/сон системы секреты не сохраняют).</w:t>
       </w:r>
     </w:p>
     <w:p>
@@ -2508,7 +2679,61 @@
         <w:t xml:space="preserve"> </w:t>
       </w:r>
       <w:r>
-        <w:t xml:space="preserve">(защита от DNS-rebinding и кросс-сайтовых запросов).</w:t>
+        <w:t xml:space="preserve">(защита от DNS-rebinding и кросс-сайтовых запросов). API-токен —</w:t>
+      </w:r>
+      <w:r>
+        <w:t xml:space="preserve"> </w:t>
+      </w:r>
+      <w:r>
+        <w:rPr>
+          <w:rStyle w:val="VerbatimChar"/>
+        </w:rPr>
+        <w:t xml:space="preserve">Mutex&lt;Zeroizing&lt;String&gt;&gt;</w:t>
+      </w:r>
+      <w:r>
+        <w:t xml:space="preserve"> </w:t>
+      </w:r>
+      <w:r>
+        <w:t xml:space="preserve">(затирание при ротации/drop); команда</w:t>
+      </w:r>
+      <w:r>
+        <w:t xml:space="preserve"> </w:t>
+      </w:r>
+      <w:r>
+        <w:rPr>
+          <w:rStyle w:val="VerbatimChar"/>
+        </w:rPr>
+        <w:t xml:space="preserve">rotate_api_token</w:t>
+      </w:r>
+      <w:r>
+        <w:t xml:space="preserve">. Перед выдачей секретов —</w:t>
+      </w:r>
+      <w:r>
+        <w:t xml:space="preserve"> </w:t>
+      </w:r>
+      <w:r>
+        <w:rPr>
+          <w:rStyle w:val="VerbatimChar"/>
+        </w:rPr>
+        <w:t xml:space="preserve">enforce_autolock()</w:t>
+      </w:r>
+      <w:r>
+        <w:t xml:space="preserve">; здесь же единый</w:t>
+      </w:r>
+      <w:r>
+        <w:t xml:space="preserve"> </w:t>
+      </w:r>
+      <w:r>
+        <w:rPr>
+          <w:rStyle w:val="VerbatimChar"/>
+        </w:rPr>
+        <w:t xml:space="preserve">domain_score</w:t>
+      </w:r>
+      <w:r>
+        <w:t xml:space="preserve"> </w:t>
+      </w:r>
+      <w:r>
+        <w:t xml:space="preserve">(eTLD+1-скоринг для IPC и HTTP).</w:t>
       </w:r>
     </w:p>
     <w:p>
@@ -2577,7 +2802,22 @@
         <w:t xml:space="preserve"> </w:t>
       </w:r>
       <w:r>
-        <w:t xml:space="preserve">(tokio, message mode, DACL только для текущего пользователя), Linux — unix-сокет</w:t>
+        <w:t xml:space="preserve">(tokio, message mode, DACL только для текущего пользователя, создание с</w:t>
+      </w:r>
+      <w:r>
+        <w:t xml:space="preserve"> </w:t>
+      </w:r>
+      <w:r>
+        <w:rPr>
+          <w:rStyle w:val="VerbatimChar"/>
+        </w:rPr>
+        <w:t xml:space="preserve">FILE_FLAG_FIRST_PIPE_INSTANCE</w:t>
+      </w:r>
+      <w:r>
+        <w:t xml:space="preserve"> </w:t>
+      </w:r>
+      <w:r>
+        <w:t xml:space="preserve">— squatting-перехват имени pipe исключён), Linux — unix-сокет</w:t>
       </w:r>
       <w:r>
         <w:t xml:space="preserve"> </w:t>
@@ -2715,7 +2955,22 @@
         <w:t xml:space="preserve"> </w:t>
       </w:r>
       <w:r>
-        <w:t xml:space="preserve">после подтверждения пользователем в диалоге. Поиск записи по домену со скорингом (точное совпадение 1000 / поддомен 500 / contains 100 / обратный contains 50).</w:t>
+        <w:t xml:space="preserve">после подтверждения пользователем в диалоге. Поиск записи по домену — eTLD+1-скоринг: точный хост 1000 / тот же регистрируемый домен 500 / остальное 0 (двусторонние</w:t>
+      </w:r>
+      <w:r>
+        <w:t xml:space="preserve"> </w:t>
+      </w:r>
+      <w:r>
+        <w:rPr>
+          <w:rStyle w:val="VerbatimChar"/>
+        </w:rPr>
+        <w:t xml:space="preserve">contains</w:t>
+      </w:r>
+      <w:r>
+        <w:t xml:space="preserve"> </w:t>
+      </w:r>
+      <w:r>
+        <w:t xml:space="preserve">убраны — lookalike-домены пароль не получают).</w:t>
       </w:r>
     </w:p>
     <w:p>
@@ -2934,7 +3189,19 @@
         <w:t xml:space="preserve"> </w:t>
       </w:r>
       <w:r>
-        <w:t xml:space="preserve">— Windows Hello: после успешного пароль-unlock ключ сессии шифруется и сохраняется в Windows Credential Manager (</w:t>
+        <w:t xml:space="preserve">— Windows Hello: после успешного пароль-unlock ключ сессии шифруется AES-256-GCM обёрткой из детерминированной подписи KeyCredential (</w:t>
+      </w:r>
+      <w:r>
+        <w:rPr>
+          <w:rStyle w:val="VerbatimChar"/>
+        </w:rPr>
+        <w:t xml:space="preserve">RequestSignAsync</w:t>
+      </w:r>
+      <w:r>
+        <w:t xml:space="preserve"> </w:t>
+      </w:r>
+      <w:r>
+        <w:t xml:space="preserve">всегда показывает Hello-промпт) и сохраняется в Windows Credential Manager (</w:t>
       </w:r>
       <w:r>
         <w:rPr>
@@ -2967,7 +3234,34 @@
         <w:t xml:space="preserve">vault/&lt;vault_id&gt;</w:t>
       </w:r>
       <w:r>
-        <w:t xml:space="preserve">); разблокировка —</w:t>
+        <w:t xml:space="preserve">) как passport-blob</w:t>
+      </w:r>
+      <w:r>
+        <w:t xml:space="preserve"> </w:t>
+      </w:r>
+      <w:r>
+        <w:rPr>
+          <w:rStyle w:val="VerbatimChar"/>
+        </w:rPr>
+        <w:t xml:space="preserve">mynx-passport-v1:*</w:t>
+      </w:r>
+      <w:r>
+        <w:t xml:space="preserve"> </w:t>
+      </w:r>
+      <w:r>
+        <w:t xml:space="preserve">(AAD</w:t>
+      </w:r>
+      <w:r>
+        <w:t xml:space="preserve"> </w:t>
+      </w:r>
+      <w:r>
+        <w:rPr>
+          <w:rStyle w:val="VerbatimChar"/>
+        </w:rPr>
+        <w:t xml:space="preserve">mynx:v2:passport-wrap</w:t>
+      </w:r>
+      <w:r>
+        <w:t xml:space="preserve">); вычитка Credential Manager напрямую/другим процессом даёт бесполезный блоб. Разблокировка —</w:t>
       </w:r>
       <w:r>
         <w:t xml:space="preserve"> </w:t>
@@ -2982,7 +3276,7 @@
         <w:t xml:space="preserve"> </w:t>
       </w:r>
       <w:r>
-        <w:t xml:space="preserve">(лицо/отпечаток/PIN), мастер-пароль не хранится. Провал верификации питает общий rate-limit.</w:t>
+        <w:t xml:space="preserve">(лицо/отпечаток/PIN), мастер-пароль не хранится. Провал верификации питает общий rate-limit. Legacy-записи (открытый hex) читаются и мигрируются при перезаписи.</w:t>
       </w:r>
       <w:r>
         <w:t xml:space="preserve"> </w:t>
@@ -3078,97 +3372,52 @@
         <w:rPr>
           <w:rStyle w:val="VerbatimChar"/>
         </w:rPr>
-        <w:t xml:space="preserve">crypto/</w:t>
-      </w:r>
-      <w:r>
-        <w:t xml:space="preserve"> </w:t>
-      </w:r>
-      <w:r>
-        <w:t xml:space="preserve">—</w:t>
-      </w:r>
-      <w:r>
-        <w:t xml:space="preserve"> </w:t>
-      </w:r>
-      <w:r>
-        <w:rPr>
-          <w:rStyle w:val="VerbatimChar"/>
-        </w:rPr>
-        <w:t xml:space="preserve">kdf.rs</w:t>
-      </w:r>
-      <w:r>
-        <w:t xml:space="preserve"> </w:t>
-      </w:r>
-      <w:r>
-        <w:t xml:space="preserve">(Argon2id),</w:t>
-      </w:r>
-      <w:r>
-        <w:t xml:space="preserve"> </w:t>
-      </w:r>
-      <w:r>
-        <w:rPr>
-          <w:rStyle w:val="VerbatimChar"/>
-        </w:rPr>
-        <w:t xml:space="preserve">hkdf.rs</w:t>
-      </w:r>
-      <w:r>
-        <w:t xml:space="preserve"> </w:t>
-      </w:r>
-      <w:r>
-        <w:t xml:space="preserve">(в т.ч. вариант с примесью секрета аппаратного ключа),</w:t>
-      </w:r>
-      <w:r>
-        <w:t xml:space="preserve"> </w:t>
-      </w:r>
-      <w:r>
-        <w:rPr>
-          <w:rStyle w:val="VerbatimChar"/>
-        </w:rPr>
-        <w:t xml:space="preserve">aead.rs</w:t>
-      </w:r>
-      <w:r>
-        <w:t xml:space="preserve"> </w:t>
-      </w:r>
-      <w:r>
-        <w:t xml:space="preserve">(AES-256-GCM через</w:t>
-      </w:r>
-      <w:r>
-        <w:t xml:space="preserve"> </w:t>
-      </w:r>
-      <w:r>
-        <w:rPr>
-          <w:rStyle w:val="VerbatimChar"/>
-        </w:rPr>
-        <w:t xml:space="preserve">ring</w:t>
-      </w:r>
-      <w:r>
-        <w:t xml:space="preserve">),</w:t>
-      </w:r>
-      <w:r>
-        <w:t xml:space="preserve"> </w:t>
-      </w:r>
-      <w:r>
-        <w:rPr>
-          <w:rStyle w:val="VerbatimChar"/>
-        </w:rPr>
-        <w:t xml:space="preserve">xchacha20.rs</w:t>
-      </w:r>
-      <w:r>
-        <w:t xml:space="preserve"> </w:t>
-      </w:r>
-      <w:r>
-        <w:t xml:space="preserve">(XChaCha20-Poly1305 через</w:t>
-      </w:r>
-      <w:r>
-        <w:t xml:space="preserve"> </w:t>
-      </w:r>
-      <w:r>
-        <w:rPr>
-          <w:rStyle w:val="VerbatimChar"/>
-        </w:rPr>
-        <w:t xml:space="preserve">chacha20poly1305</w:t>
-      </w:r>
-      <w:r>
-        <w:t xml:space="preserve">).</w:t>
+        <w:t xml:space="preserve">logging.rs</w:t>
+      </w:r>
+      <w:r>
+        <w:t xml:space="preserve"> </w:t>
+      </w:r>
+      <w:r>
+        <w:t xml:space="preserve">— уровневое логирование INFO/WARN/ERROR: файл</w:t>
+      </w:r>
+      <w:r>
+        <w:t xml:space="preserve"> </w:t>
+      </w:r>
+      <w:r>
+        <w:rPr>
+          <w:rStyle w:val="VerbatimChar"/>
+        </w:rPr>
+        <w:t xml:space="preserve">&lt;app_data_dir&gt;/logs/mynx.log</w:t>
+      </w:r>
+      <w:r>
+        <w:t xml:space="preserve">, ротация при 5 МБ →</w:t>
+      </w:r>
+      <w:r>
+        <w:t xml:space="preserve"> </w:t>
+      </w:r>
+      <w:r>
+        <w:rPr>
+          <w:rStyle w:val="VerbatimChar"/>
+        </w:rPr>
+        <w:t xml:space="preserve">mynx.old.log</w:t>
+      </w:r>
+      <w:r>
+        <w:t xml:space="preserve">; WARN/ERROR дублируются в stderr; секреты в логи не пишутся (все вызовы</w:t>
+      </w:r>
+      <w:r>
+        <w:t xml:space="preserve"> </w:t>
+      </w:r>
+      <w:r>
+        <w:rPr>
+          <w:rStyle w:val="VerbatimChar"/>
+        </w:rPr>
+        <w:t xml:space="preserve">eprintln!</w:t>
+      </w:r>
+      <w:r>
+        <w:t xml:space="preserve"> </w:t>
+      </w:r>
+      <w:r>
+        <w:t xml:space="preserve">переведены).</w:t>
       </w:r>
     </w:p>
     <w:p>
@@ -3183,7 +3432,7 @@
         <w:rPr>
           <w:rStyle w:val="VerbatimChar"/>
         </w:rPr>
-        <w:t xml:space="preserve">vault/</w:t>
+        <w:t xml:space="preserve">crypto/</w:t>
       </w:r>
       <w:r>
         <w:t xml:space="preserve"> </w:t>
@@ -3198,34 +3447,64 @@
         <w:rPr>
           <w:rStyle w:val="VerbatimChar"/>
         </w:rPr>
-        <w:t xml:space="preserve">types.rs</w:t>
-      </w:r>
-      <w:r>
-        <w:t xml:space="preserve"> </w:t>
-      </w:r>
-      <w:r>
-        <w:t xml:space="preserve">(заголовок с decoy-слотом и hw-key, magic</w:t>
-      </w:r>
-      <w:r>
-        <w:t xml:space="preserve"> </w:t>
-      </w:r>
-      <w:r>
-        <w:rPr>
-          <w:rStyle w:val="VerbatimChar"/>
-        </w:rPr>
-        <w:t xml:space="preserve">SAFEPASS</w:t>
-      </w:r>
-      <w:r>
-        <w:t xml:space="preserve">, export-формат</w:t>
-      </w:r>
-      <w:r>
-        <w:t xml:space="preserve"> </w:t>
-      </w:r>
-      <w:r>
-        <w:rPr>
-          <w:rStyle w:val="VerbatimChar"/>
-        </w:rPr>
-        <w:t xml:space="preserve">SAFEPASS-EXP</w:t>
+        <w:t xml:space="preserve">kdf.rs</w:t>
+      </w:r>
+      <w:r>
+        <w:t xml:space="preserve"> </w:t>
+      </w:r>
+      <w:r>
+        <w:t xml:space="preserve">(Argon2id; параметры из файла валидируются —</w:t>
+      </w:r>
+      <w:r>
+        <w:t xml:space="preserve"> </w:t>
+      </w:r>
+      <w:r>
+        <w:rPr>
+          <w:rStyle w:val="VerbatimChar"/>
+        </w:rPr>
+        <w:t xml:space="preserve">to_argon2_params() -&gt; Result&lt;Params&gt;</w:t>
+      </w:r>
+      <w:r>
+        <w:t xml:space="preserve">, паника на подделке исключена),</w:t>
+      </w:r>
+      <w:r>
+        <w:t xml:space="preserve"> </w:t>
+      </w:r>
+      <w:r>
+        <w:rPr>
+          <w:rStyle w:val="VerbatimChar"/>
+        </w:rPr>
+        <w:t xml:space="preserve">hkdf.rs</w:t>
+      </w:r>
+      <w:r>
+        <w:t xml:space="preserve"> </w:t>
+      </w:r>
+      <w:r>
+        <w:t xml:space="preserve">(в т.ч. вариант с примесью секрета аппаратного ключа),</w:t>
+      </w:r>
+      <w:r>
+        <w:t xml:space="preserve"> </w:t>
+      </w:r>
+      <w:r>
+        <w:rPr>
+          <w:rStyle w:val="VerbatimChar"/>
+        </w:rPr>
+        <w:t xml:space="preserve">aead.rs</w:t>
+      </w:r>
+      <w:r>
+        <w:t xml:space="preserve"> </w:t>
+      </w:r>
+      <w:r>
+        <w:t xml:space="preserve">(AES-256-GCM через</w:t>
+      </w:r>
+      <w:r>
+        <w:t xml:space="preserve"> </w:t>
+      </w:r>
+      <w:r>
+        <w:rPr>
+          <w:rStyle w:val="VerbatimChar"/>
+        </w:rPr>
+        <w:t xml:space="preserve">ring</w:t>
       </w:r>
       <w:r>
         <w:t xml:space="preserve">,</w:t>
@@ -3237,31 +3516,16 @@
         <w:rPr>
           <w:rStyle w:val="VerbatimChar"/>
         </w:rPr>
-        <w:t xml:space="preserve">VaultSession</w:t>
-      </w:r>
-      <w:r>
-        <w:t xml:space="preserve"> </w:t>
-      </w:r>
-      <w:r>
-        <w:t xml:space="preserve">с</w:t>
-      </w:r>
-      <w:r>
-        <w:t xml:space="preserve"> </w:t>
-      </w:r>
-      <w:r>
-        <w:rPr>
-          <w:rStyle w:val="VerbatimChar"/>
-        </w:rPr>
-        <w:t xml:space="preserve">Drop</w:t>
-      </w:r>
-      <w:r>
-        <w:t xml:space="preserve">→</w:t>
-      </w:r>
-      <w:r>
-        <w:rPr>
-          <w:rStyle w:val="VerbatimChar"/>
-        </w:rPr>
-        <w:t xml:space="preserve">zeroize</w:t>
+        <w:t xml:space="preserve">encrypt_with_aad</w:t>
+      </w:r>
+      <w:r>
+        <w:t xml:space="preserve">/</w:t>
+      </w:r>
+      <w:r>
+        <w:rPr>
+          <w:rStyle w:val="VerbatimChar"/>
+        </w:rPr>
+        <w:t xml:space="preserve">decrypt_with_aad</w:t>
       </w:r>
       <w:r>
         <w:t xml:space="preserve">),</w:t>
@@ -3273,33 +3537,204 @@
         <w:rPr>
           <w:rStyle w:val="VerbatimChar"/>
         </w:rPr>
-        <w:t xml:space="preserve">operations.rs</w:t>
-      </w:r>
-      <w:r>
-        <w:t xml:space="preserve"> </w:t>
-      </w:r>
-      <w:r>
-        <w:t xml:space="preserve">(load/save, атомарная запись через</w:t>
-      </w:r>
-      <w:r>
-        <w:t xml:space="preserve"> </w:t>
-      </w:r>
-      <w:r>
-        <w:rPr>
-          <w:rStyle w:val="VerbatimChar"/>
-        </w:rPr>
-        <w:t xml:space="preserve">safepass.tmp</w:t>
-      </w:r>
-      <w:r>
-        <w:t xml:space="preserve">, двухслойное шифрование, decoy-слой, смена пароля, экспорт).</w:t>
+        <w:t xml:space="preserve">xchacha20.rs</w:t>
+      </w:r>
+      <w:r>
+        <w:t xml:space="preserve"> </w:t>
+      </w:r>
+      <w:r>
+        <w:t xml:space="preserve">(XChaCha20-Poly1305 через</w:t>
+      </w:r>
+      <w:r>
+        <w:t xml:space="preserve"> </w:t>
+      </w:r>
+      <w:r>
+        <w:rPr>
+          <w:rStyle w:val="VerbatimChar"/>
+        </w:rPr>
+        <w:t xml:space="preserve">chacha20poly1305</w:t>
+      </w:r>
+      <w:r>
+        <w:t xml:space="preserve">, AAD-варианты).</w:t>
       </w:r>
     </w:p>
     <w:p>
       <w:pPr>
+        <w:pStyle w:val="Compact"/>
+        <w:numPr>
+          <w:ilvl w:val="0"/>
+          <w:numId w:val="1002"/>
+        </w:numPr>
+      </w:pPr>
+      <w:r>
+        <w:rPr>
+          <w:rStyle w:val="VerbatimChar"/>
+        </w:rPr>
+        <w:t xml:space="preserve">vault/</w:t>
+      </w:r>
+      <w:r>
+        <w:t xml:space="preserve"> </w:t>
+      </w:r>
+      <w:r>
+        <w:t xml:space="preserve">—</w:t>
+      </w:r>
+      <w:r>
+        <w:t xml:space="preserve"> </w:t>
+      </w:r>
+      <w:r>
+        <w:rPr>
+          <w:rStyle w:val="VerbatimChar"/>
+        </w:rPr>
+        <w:t xml:space="preserve">types.rs</w:t>
+      </w:r>
+      <w:r>
+        <w:t xml:space="preserve"> </w:t>
+      </w:r>
+      <w:r>
+        <w:t xml:space="preserve">(заголовок с decoy-слотом и hw-key, magic</w:t>
+      </w:r>
+      <w:r>
+        <w:t xml:space="preserve"> </w:t>
+      </w:r>
+      <w:r>
+        <w:rPr>
+          <w:rStyle w:val="VerbatimChar"/>
+        </w:rPr>
+        <w:t xml:space="preserve">SAFEPASS</w:t>
+      </w:r>
+      <w:r>
+        <w:t xml:space="preserve">, export-формат</w:t>
+      </w:r>
+      <w:r>
+        <w:t xml:space="preserve"> </w:t>
+      </w:r>
+      <w:r>
+        <w:rPr>
+          <w:rStyle w:val="VerbatimChar"/>
+        </w:rPr>
+        <w:t xml:space="preserve">SAFEPASS-EXP</w:t>
+      </w:r>
+      <w:r>
+        <w:t xml:space="preserve">,</w:t>
+      </w:r>
+      <w:r>
+        <w:t xml:space="preserve"> </w:t>
+      </w:r>
+      <w:r>
+        <w:rPr>
+          <w:rStyle w:val="VerbatimChar"/>
+        </w:rPr>
+        <w:t xml:space="preserve">VaultSession</w:t>
+      </w:r>
+      <w:r>
+        <w:t xml:space="preserve"> </w:t>
+      </w:r>
+      <w:r>
+        <w:t xml:space="preserve">с</w:t>
+      </w:r>
+      <w:r>
+        <w:t xml:space="preserve"> </w:t>
+      </w:r>
+      <w:r>
+        <w:rPr>
+          <w:rStyle w:val="VerbatimChar"/>
+        </w:rPr>
+        <w:t xml:space="preserve">Drop</w:t>
+      </w:r>
+      <w:r>
+        <w:t xml:space="preserve">→</w:t>
+      </w:r>
+      <w:r>
+        <w:rPr>
+          <w:rStyle w:val="VerbatimChar"/>
+        </w:rPr>
+        <w:t xml:space="preserve">zeroize</w:t>
+      </w:r>
+      <w:r>
+        <w:t xml:space="preserve">),</w:t>
+      </w:r>
+      <w:r>
+        <w:t xml:space="preserve"> </w:t>
+      </w:r>
+      <w:r>
+        <w:rPr>
+          <w:rStyle w:val="VerbatimChar"/>
+        </w:rPr>
+        <w:t xml:space="preserve">operations.rs</w:t>
+      </w:r>
+      <w:r>
+        <w:t xml:space="preserve"> </w:t>
+      </w:r>
+      <w:r>
+        <w:t xml:space="preserve">(load/save; все записи сериализованы</w:t>
+      </w:r>
+      <w:r>
+        <w:t xml:space="preserve"> </w:t>
+      </w:r>
+      <w:r>
+        <w:rPr>
+          <w:rStyle w:val="VerbatimChar"/>
+        </w:rPr>
+        <w:t xml:space="preserve">VAULT_WRITE_LOCK</w:t>
+      </w:r>
+      <w:r>
+        <w:t xml:space="preserve"> </w:t>
+      </w:r>
+      <w:r>
+        <w:t xml:space="preserve">— гонка параллельных сохранений устранена; запись: tmp →</w:t>
+      </w:r>
+      <w:r>
+        <w:t xml:space="preserve"> </w:t>
+      </w:r>
+      <w:r>
+        <w:rPr>
+          <w:rStyle w:val="VerbatimChar"/>
+        </w:rPr>
+        <w:t xml:space="preserve">sync_all()</w:t>
+      </w:r>
+      <w:r>
+        <w:t xml:space="preserve"> </w:t>
+      </w:r>
+      <w:r>
+        <w:t xml:space="preserve">→ копия предыдущей версии в</w:t>
+      </w:r>
+      <w:r>
+        <w:t xml:space="preserve"> </w:t>
+      </w:r>
+      <w:r>
+        <w:rPr>
+          <w:rStyle w:val="VerbatimChar"/>
+        </w:rPr>
+        <w:t xml:space="preserve">*.safepass.bak</w:t>
+      </w:r>
+      <w:r>
+        <w:t xml:space="preserve"> </w:t>
+      </w:r>
+      <w:r>
+        <w:t xml:space="preserve">→ rename; AAD v2-привязка ролей</w:t>
+      </w:r>
+      <w:r>
+        <w:t xml:space="preserve"> </w:t>
+      </w:r>
+      <w:r>
+        <w:rPr>
+          <w:rStyle w:val="VerbatimChar"/>
+        </w:rPr>
+        <w:t xml:space="preserve">mynx:v2:header/payload/decoy-header/export/hw-keyfile</w:t>
+      </w:r>
+      <w:r>
+        <w:t xml:space="preserve"> </w:t>
+      </w:r>
+      <w:r>
+        <w:t xml:space="preserve">с legacy-fallback; двухслойное шифрование, decoy-слой, смена пароля, экспорт).</w:t>
+      </w:r>
+    </w:p>
+    <w:p>
+      <w:pPr>
         <w:pStyle w:val="FirstParagraph"/>
       </w:pPr>
       <w:r>
-        <w:t xml:space="preserve">Зарегистрированные Tauri-команды (38 +</w:t>
+        <w:t xml:space="preserve">Зарегистрированные Tauri-команды (40 +</w:t>
       </w:r>
       <w:r>
         <w:t xml:space="preserve"> </w:t>
@@ -3900,6 +4335,18 @@
               <w:rPr>
                 <w:rStyle w:val="VerbatimChar"/>
               </w:rPr>
+              <w:t xml:space="preserve">rotate_api_token</w:t>
+            </w:r>
+            <w:r>
+              <w:t xml:space="preserve">,</w:t>
+            </w:r>
+            <w:r>
+              <w:t xml:space="preserve"> </w:t>
+            </w:r>
+            <w:r>
+              <w:rPr>
+                <w:rStyle w:val="VerbatimChar"/>
+              </w:rPr>
               <w:t xml:space="preserve">get_device_key</w:t>
             </w:r>
             <w:r>
@@ -3913,6 +4360,18 @@
                 <w:rStyle w:val="VerbatimChar"/>
               </w:rPr>
               <w:t xml:space="preserve">set_lock_on_hide</w:t>
+            </w:r>
+            <w:r>
+              <w:t xml:space="preserve">,</w:t>
+            </w:r>
+            <w:r>
+              <w:t xml:space="preserve"> </w:t>
+            </w:r>
+            <w:r>
+              <w:rPr>
+                <w:rStyle w:val="VerbatimChar"/>
+              </w:rPr>
+              <w:t xml:space="preserve">set_autolock_minutes</w:t>
             </w:r>
             <w:r>
               <w:t xml:space="preserve">,</w:t>
@@ -4485,6 +4944,41 @@
               <w:jc w:val="left"/>
             </w:pPr>
             <w:r>
+              <w:t xml:space="preserve">AAD-привязка</w:t>
+            </w:r>
+          </w:p>
+        </w:tc>
+        <w:tc>
+          <w:tcPr/>
+          <w:p>
+            <w:pPr>
+              <w:pStyle w:val="Compact"/>
+              <w:jc w:val="left"/>
+            </w:pPr>
+            <w:r>
+              <w:rPr>
+                <w:rStyle w:val="VerbatimChar"/>
+              </w:rPr>
+              <w:t xml:space="preserve">mynx:v2:{header,payload,decoy-header,export,hw-keyfile,clipboard,passport-wrap}</w:t>
+            </w:r>
+            <w:r>
+              <w:t xml:space="preserve"> </w:t>
+            </w:r>
+            <w:r>
+              <w:t xml:space="preserve">— роль каждого шифроблока аутентифицируется (v2, legacy-чтение без AAD сохранено)</w:t>
+            </w:r>
+          </w:p>
+        </w:tc>
+      </w:tr>
+      <w:tr>
+        <w:tc>
+          <w:tcPr/>
+          <w:p>
+            <w:pPr>
+              <w:pStyle w:val="Compact"/>
+              <w:jc w:val="left"/>
+            </w:pPr>
+            <w:r>
               <w:t xml:space="preserve">CSPRNG</w:t>
             </w:r>
           </w:p>
@@ -5442,6 +5936,24 @@
               </w:rPr>
               <w:t xml:space="preserve">format</w:t>
             </w:r>
+            <w:r>
+              <w:t xml:space="preserve">,</w:t>
+            </w:r>
+            <w:r>
+              <w:t xml:space="preserve"> </w:t>
+            </w:r>
+            <w:r>
+              <w:rPr>
+                <w:rStyle w:val="VerbatimChar"/>
+              </w:rPr>
+              <w:t xml:space="preserve">test</w:t>
+            </w:r>
+            <w:r>
+              <w:t xml:space="preserve"> </w:t>
+            </w:r>
+            <w:r>
+              <w:t xml:space="preserve">(vitest: 15 тестов — safeExternalUrl, шифрование вложений, паритет i18n)</w:t>
+            </w:r>
           </w:p>
         </w:tc>
       </w:tr>
@@ -5609,7 +6121,19 @@
               <w:jc w:val="left"/>
             </w:pPr>
             <w:r>
-              <w:t xml:space="preserve">Release-сборка под Windows</w:t>
+              <w:t xml:space="preserve">Release-сборка под Windows (пути от</w:t>
+            </w:r>
+            <w:r>
+              <w:t xml:space="preserve"> </w:t>
+            </w:r>
+            <w:r>
+              <w:rPr>
+                <w:rStyle w:val="VerbatimChar"/>
+              </w:rPr>
+              <w:t xml:space="preserve">%~dp0</w:t>
+            </w:r>
+            <w:r>
+              <w:t xml:space="preserve">, без персональных PATH/vcvars-захардкоженных путей)</w:t>
             </w:r>
           </w:p>
         </w:tc>
@@ -5667,7 +6191,34 @@
               <w:jc w:val="left"/>
             </w:pPr>
             <w:r>
-              <w:t xml:space="preserve">Упаковка расширения в ZIP для Chrome Web Store</w:t>
+              <w:t xml:space="preserve">Упаковка расширения в ZIP для Chrome Web Store (дублируется workflow</w:t>
+            </w:r>
+            <w:r>
+              <w:t xml:space="preserve"> </w:t>
+            </w:r>
+            <w:r>
+              <w:rPr>
+                <w:rStyle w:val="VerbatimChar"/>
+              </w:rPr>
+              <w:t xml:space="preserve">extension-pack.yml</w:t>
+            </w:r>
+            <w:r>
+              <w:t xml:space="preserve"> </w:t>
+            </w:r>
+            <w:r>
+              <w:t xml:space="preserve">по тегу</w:t>
+            </w:r>
+            <w:r>
+              <w:t xml:space="preserve"> </w:t>
+            </w:r>
+            <w:r>
+              <w:rPr>
+                <w:rStyle w:val="VerbatimChar"/>
+              </w:rPr>
+              <w:t xml:space="preserve">ext-v*</w:t>
+            </w:r>
+            <w:r>
+              <w:t xml:space="preserve">)</w:t>
             </w:r>
           </w:p>
         </w:tc>
@@ -5756,6 +6307,137 @@
                 <w:rStyle w:val="VerbatimChar"/>
               </w:rPr>
               <w:t xml:space="preserve">mynx-native-host</w:t>
+            </w:r>
+          </w:p>
+        </w:tc>
+      </w:tr>
+      <w:tr>
+        <w:tc>
+          <w:tcPr/>
+          <w:p>
+            <w:pPr>
+              <w:pStyle w:val="Compact"/>
+              <w:jc w:val="left"/>
+            </w:pPr>
+            <w:r>
+              <w:t xml:space="preserve">GitHub Actions</w:t>
+            </w:r>
+          </w:p>
+        </w:tc>
+        <w:tc>
+          <w:tcPr/>
+          <w:p>
+            <w:pPr>
+              <w:pStyle w:val="Compact"/>
+              <w:jc w:val="left"/>
+            </w:pPr>
+            <w:r>
+              <w:rPr>
+                <w:rStyle w:val="VerbatimChar"/>
+              </w:rPr>
+              <w:t xml:space="preserve">security.yml</w:t>
+            </w:r>
+            <w:r>
+              <w:t xml:space="preserve"> </w:t>
+            </w:r>
+            <w:r>
+              <w:t xml:space="preserve">(push/PR/еженедельный cron:</w:t>
+            </w:r>
+            <w:r>
+              <w:t xml:space="preserve"> </w:t>
+            </w:r>
+            <w:r>
+              <w:rPr>
+                <w:rStyle w:val="VerbatimChar"/>
+              </w:rPr>
+              <w:t xml:space="preserve">cargo test</w:t>
+            </w:r>
+            <w:r>
+              <w:t xml:space="preserve">,</w:t>
+            </w:r>
+            <w:r>
+              <w:t xml:space="preserve"> </w:t>
+            </w:r>
+            <w:r>
+              <w:rPr>
+                <w:rStyle w:val="VerbatimChar"/>
+              </w:rPr>
+              <w:t xml:space="preserve">cargo clippy --all-targets -- -D warnings</w:t>
+            </w:r>
+            <w:r>
+              <w:t xml:space="preserve">,</w:t>
+            </w:r>
+            <w:r>
+              <w:t xml:space="preserve"> </w:t>
+            </w:r>
+            <w:r>
+              <w:rPr>
+                <w:rStyle w:val="VerbatimChar"/>
+              </w:rPr>
+              <w:t xml:space="preserve">cargo audit</w:t>
+            </w:r>
+            <w:r>
+              <w:t xml:space="preserve">,</w:t>
+            </w:r>
+            <w:r>
+              <w:t xml:space="preserve"> </w:t>
+            </w:r>
+            <w:r>
+              <w:rPr>
+                <w:rStyle w:val="VerbatimChar"/>
+              </w:rPr>
+              <w:t xml:space="preserve">npm audit</w:t>
+            </w:r>
+            <w:r>
+              <w:t xml:space="preserve"> </w:t>
+            </w:r>
+            <w:r>
+              <w:t xml:space="preserve">prod-блокирующий + dev-отчётный),</w:t>
+            </w:r>
+            <w:r>
+              <w:t xml:space="preserve"> </w:t>
+            </w:r>
+            <w:r>
+              <w:rPr>
+                <w:rStyle w:val="VerbatimChar"/>
+              </w:rPr>
+              <w:t xml:space="preserve">frontend-tests.yml</w:t>
+            </w:r>
+            <w:r>
+              <w:t xml:space="preserve"> </w:t>
+            </w:r>
+            <w:r>
+              <w:t xml:space="preserve">(tsc + vitest),</w:t>
+            </w:r>
+            <w:r>
+              <w:t xml:space="preserve"> </w:t>
+            </w:r>
+            <w:r>
+              <w:rPr>
+                <w:rStyle w:val="VerbatimChar"/>
+              </w:rPr>
+              <w:t xml:space="preserve">extension-pack.yml</w:t>
+            </w:r>
+            <w:r>
+              <w:t xml:space="preserve"> </w:t>
+            </w:r>
+            <w:r>
+              <w:t xml:space="preserve">(zip по тегу),</w:t>
+            </w:r>
+            <w:r>
+              <w:t xml:space="preserve"> </w:t>
+            </w:r>
+            <w:r>
+              <w:rPr>
+                <w:rStyle w:val="VerbatimChar"/>
+              </w:rPr>
+              <w:t xml:space="preserve">docs-build.yml</w:t>
+            </w:r>
+            <w:r>
+              <w:t xml:space="preserve"> </w:t>
+            </w:r>
+            <w:r>
+              <w:t xml:space="preserve">(pandoc: docs/*.md → tech-stack.docx, artifact); Dependabot: npm/cargo — weekly, actions — monthly</w:t>
             </w:r>
           </w:p>
         </w:tc>
@@ -6056,21 +6738,36 @@
               <w:t xml:space="preserve"> </w:t>
             </w:r>
             <w:r>
-              <w:t xml:space="preserve">(только при включённом Hello)</w:t>
-            </w:r>
-          </w:p>
-        </w:tc>
-      </w:tr>
-      <w:tr>
-        <w:tc>
-          <w:tcPr/>
-          <w:p>
-            <w:pPr>
-              <w:pStyle w:val="Compact"/>
-              <w:jc w:val="left"/>
-            </w:pPr>
-            <w:r>
-              <w:t xml:space="preserve">Настройки UI / категории / вложения</w:t>
+              <w:t xml:space="preserve">— passport-blob</w:t>
+            </w:r>
+            <w:r>
+              <w:t xml:space="preserve"> </w:t>
+            </w:r>
+            <w:r>
+              <w:rPr>
+                <w:rStyle w:val="VerbatimChar"/>
+              </w:rPr>
+              <w:t xml:space="preserve">mynx-passport-v1:*</w:t>
+            </w:r>
+            <w:r>
+              <w:t xml:space="preserve"> </w:t>
+            </w:r>
+            <w:r>
+              <w:t xml:space="preserve">(ключ сессии зашифрован обёрткой из подписи KeyCredential; только при включённом Hello)</w:t>
+            </w:r>
+          </w:p>
+        </w:tc>
+      </w:tr>
+      <w:tr>
+        <w:tc>
+          <w:tcPr/>
+          <w:p>
+            <w:pPr>
+              <w:pStyle w:val="Compact"/>
+              <w:jc w:val="left"/>
+            </w:pPr>
+            <w:r>
+              <w:t xml:space="preserve">Настройки UI / категории</w:t>
             </w:r>
           </w:p>
         </w:tc>
@@ -6112,19 +6809,238 @@
               <w:rPr>
                 <w:rStyle w:val="VerbatimChar"/>
               </w:rPr>
+              <w:t xml:space="preserve">mynx-lang</w:t>
+            </w:r>
+            <w:r>
+              <w:t xml:space="preserve">)</w:t>
+            </w:r>
+          </w:p>
+        </w:tc>
+      </w:tr>
+      <w:tr>
+        <w:tc>
+          <w:tcPr/>
+          <w:p>
+            <w:pPr>
+              <w:pStyle w:val="Compact"/>
+              <w:jc w:val="left"/>
+            </w:pPr>
+            <w:r>
+              <w:t xml:space="preserve">Вложения</w:t>
+            </w:r>
+          </w:p>
+        </w:tc>
+        <w:tc>
+          <w:tcPr/>
+          <w:p>
+            <w:pPr>
+              <w:pStyle w:val="Compact"/>
+              <w:jc w:val="left"/>
+            </w:pPr>
+            <w:r>
+              <w:t xml:space="preserve">localStorage</w:t>
+            </w:r>
+            <w:r>
+              <w:t xml:space="preserve"> </w:t>
+            </w:r>
+            <w:r>
+              <w:rPr>
+                <w:rStyle w:val="VerbatimChar"/>
+              </w:rPr>
               <w:t xml:space="preserve">mynx-attachments</w:t>
             </w:r>
             <w:r>
-              <w:t xml:space="preserve">,</w:t>
-            </w:r>
-            <w:r>
-              <w:t xml:space="preserve"> </w:t>
-            </w:r>
-            <w:r>
-              <w:rPr>
-                <w:rStyle w:val="VerbatimChar"/>
-              </w:rPr>
-              <w:t xml:space="preserve">mynx-lang</w:t>
+              <w:t xml:space="preserve"> </w:t>
+            </w:r>
+            <w:r>
+              <w:t xml:space="preserve">— шифрованный снапшот AES-256-GCM (</w:t>
+            </w:r>
+            <w:r>
+              <w:rPr>
+                <w:rStyle w:val="VerbatimChar"/>
+              </w:rPr>
+              <w:t xml:space="preserve">{"mynx-enc-v1":…}</w:t>
+            </w:r>
+            <w:r>
+              <w:t xml:space="preserve">, ключ — неэкспортируемый CryptoKey в IndexedDB)</w:t>
+            </w:r>
+          </w:p>
+        </w:tc>
+      </w:tr>
+      <w:tr>
+        <w:tc>
+          <w:tcPr/>
+          <w:p>
+            <w:pPr>
+              <w:pStyle w:val="Compact"/>
+              <w:jc w:val="left"/>
+            </w:pPr>
+            <w:r>
+              <w:t xml:space="preserve">Резервная копия сейфа</w:t>
+            </w:r>
+          </w:p>
+        </w:tc>
+        <w:tc>
+          <w:tcPr/>
+          <w:p>
+            <w:pPr>
+              <w:pStyle w:val="Compact"/>
+              <w:jc w:val="left"/>
+            </w:pPr>
+            <w:r>
+              <w:rPr>
+                <w:rStyle w:val="VerbatimChar"/>
+              </w:rPr>
+              <w:t xml:space="preserve">&lt;vault&gt;.safepass.bak</w:t>
+            </w:r>
+            <w:r>
+              <w:t xml:space="preserve"> </w:t>
+            </w:r>
+            <w:r>
+              <w:t xml:space="preserve">— предыдущая версия файла, обновляется при каждом сохранении (после fsync, до rename)</w:t>
+            </w:r>
+          </w:p>
+        </w:tc>
+      </w:tr>
+      <w:tr>
+        <w:tc>
+          <w:tcPr/>
+          <w:p>
+            <w:pPr>
+              <w:pStyle w:val="Compact"/>
+              <w:jc w:val="left"/>
+            </w:pPr>
+            <w:r>
+              <w:t xml:space="preserve">Tray-хоткей</w:t>
+            </w:r>
+          </w:p>
+        </w:tc>
+        <w:tc>
+          <w:tcPr/>
+          <w:p>
+            <w:pPr>
+              <w:pStyle w:val="Compact"/>
+              <w:jc w:val="left"/>
+            </w:pPr>
+            <w:r>
+              <w:t xml:space="preserve">HKCU-реестр/</w:t>
+            </w:r>
+            <w:r>
+              <w:rPr>
+                <w:rStyle w:val="VerbatimChar"/>
+              </w:rPr>
+              <w:t xml:space="preserve">settings.json</w:t>
+            </w:r>
+            <w:r>
+              <w:t xml:space="preserve"> </w:t>
+            </w:r>
+            <w:r>
+              <w:t xml:space="preserve">(Rust-сторона)</w:t>
+            </w:r>
+          </w:p>
+        </w:tc>
+      </w:tr>
+      <w:tr>
+        <w:tc>
+          <w:tcPr/>
+          <w:p>
+            <w:pPr>
+              <w:pStyle w:val="Compact"/>
+              <w:jc w:val="left"/>
+            </w:pPr>
+            <w:r>
+              <w:t xml:space="preserve">Ключ pairing расширения</w:t>
+            </w:r>
+          </w:p>
+        </w:tc>
+        <w:tc>
+          <w:tcPr/>
+          <w:p>
+            <w:pPr>
+              <w:pStyle w:val="Compact"/>
+              <w:jc w:val="left"/>
+            </w:pPr>
+            <w:r>
+              <w:t xml:space="preserve">В памяти Rust-процесса до перезапуска; в браузере —</w:t>
+            </w:r>
+            <w:r>
+              <w:t xml:space="preserve"> </w:t>
+            </w:r>
+            <w:r>
+              <w:rPr>
+                <w:rStyle w:val="VerbatimChar"/>
+              </w:rPr>
+              <w:t xml:space="preserve">chrome.storage.session</w:t>
+            </w:r>
+          </w:p>
+        </w:tc>
+      </w:tr>
+      <w:tr>
+        <w:tc>
+          <w:tcPr/>
+          <w:p>
+            <w:pPr>
+              <w:pStyle w:val="Compact"/>
+              <w:jc w:val="left"/>
+            </w:pPr>
+            <w:r>
+              <w:t xml:space="preserve">Защищённый буфер</w:t>
+            </w:r>
+          </w:p>
+        </w:tc>
+        <w:tc>
+          <w:tcPr/>
+          <w:p>
+            <w:pPr>
+              <w:pStyle w:val="Compact"/>
+              <w:jc w:val="left"/>
+            </w:pPr>
+            <w:r>
+              <w:t xml:space="preserve">Только в памяти процесса, AES-256-GCM-шифрованный, одноразовый</w:t>
+            </w:r>
+          </w:p>
+        </w:tc>
+      </w:tr>
+      <w:tr>
+        <w:tc>
+          <w:tcPr/>
+          <w:p>
+            <w:pPr>
+              <w:pStyle w:val="Compact"/>
+              <w:jc w:val="left"/>
+            </w:pPr>
+            <w:r>
+              <w:t xml:space="preserve">Логи приложения</w:t>
+            </w:r>
+          </w:p>
+        </w:tc>
+        <w:tc>
+          <w:tcPr/>
+          <w:p>
+            <w:pPr>
+              <w:pStyle w:val="Compact"/>
+              <w:jc w:val="left"/>
+            </w:pPr>
+            <w:r>
+              <w:rPr>
+                <w:rStyle w:val="VerbatimChar"/>
+              </w:rPr>
+              <w:t xml:space="preserve">&lt;app_data_dir&gt;/logs/mynx.log</w:t>
+            </w:r>
+            <w:r>
+              <w:t xml:space="preserve"> </w:t>
+            </w:r>
+            <w:r>
+              <w:t xml:space="preserve">(INFO/WARN/ERROR, ротация 5 МБ →</w:t>
+            </w:r>
+            <w:r>
+              <w:t xml:space="preserve"> </w:t>
+            </w:r>
+            <w:r>
+              <w:rPr>
+                <w:rStyle w:val="VerbatimChar"/>
+              </w:rPr>
+              <w:t xml:space="preserve">mynx.old.log</w:t>
             </w:r>
             <w:r>
               <w:t xml:space="preserve">)</w:t>
@@ -6141,105 +7057,6 @@
               <w:jc w:val="left"/>
             </w:pPr>
             <w:r>
-              <w:t xml:space="preserve">Tray-хоткей</w:t>
-            </w:r>
-          </w:p>
-        </w:tc>
-        <w:tc>
-          <w:tcPr/>
-          <w:p>
-            <w:pPr>
-              <w:pStyle w:val="Compact"/>
-              <w:jc w:val="left"/>
-            </w:pPr>
-            <w:r>
-              <w:t xml:space="preserve">HKCU-реестр/</w:t>
-            </w:r>
-            <w:r>
-              <w:rPr>
-                <w:rStyle w:val="VerbatimChar"/>
-              </w:rPr>
-              <w:t xml:space="preserve">settings.json</w:t>
-            </w:r>
-            <w:r>
-              <w:t xml:space="preserve"> </w:t>
-            </w:r>
-            <w:r>
-              <w:t xml:space="preserve">(Rust-сторона)</w:t>
-            </w:r>
-          </w:p>
-        </w:tc>
-      </w:tr>
-      <w:tr>
-        <w:tc>
-          <w:tcPr/>
-          <w:p>
-            <w:pPr>
-              <w:pStyle w:val="Compact"/>
-              <w:jc w:val="left"/>
-            </w:pPr>
-            <w:r>
-              <w:t xml:space="preserve">Ключ pairing расширения</w:t>
-            </w:r>
-          </w:p>
-        </w:tc>
-        <w:tc>
-          <w:tcPr/>
-          <w:p>
-            <w:pPr>
-              <w:pStyle w:val="Compact"/>
-              <w:jc w:val="left"/>
-            </w:pPr>
-            <w:r>
-              <w:t xml:space="preserve">В памяти Rust-процесса до перезапуска; в браузере —</w:t>
-            </w:r>
-            <w:r>
-              <w:t xml:space="preserve"> </w:t>
-            </w:r>
-            <w:r>
-              <w:rPr>
-                <w:rStyle w:val="VerbatimChar"/>
-              </w:rPr>
-              <w:t xml:space="preserve">chrome.storage.session</w:t>
-            </w:r>
-          </w:p>
-        </w:tc>
-      </w:tr>
-      <w:tr>
-        <w:tc>
-          <w:tcPr/>
-          <w:p>
-            <w:pPr>
-              <w:pStyle w:val="Compact"/>
-              <w:jc w:val="left"/>
-            </w:pPr>
-            <w:r>
-              <w:t xml:space="preserve">Защищённый буфер</w:t>
-            </w:r>
-          </w:p>
-        </w:tc>
-        <w:tc>
-          <w:tcPr/>
-          <w:p>
-            <w:pPr>
-              <w:pStyle w:val="Compact"/>
-              <w:jc w:val="left"/>
-            </w:pPr>
-            <w:r>
-              <w:t xml:space="preserve">Только в памяти процесса, AES-256-GCM-шифрованный, одноразовый</w:t>
-            </w:r>
-          </w:p>
-        </w:tc>
-      </w:tr>
-      <w:tr>
-        <w:tc>
-          <w:tcPr/>
-          <w:p>
-            <w:pPr>
-              <w:pStyle w:val="Compact"/>
-              <w:jc w:val="left"/>
-            </w:pPr>
-            <w:r>
               <w:t xml:space="preserve">Сессия (ключи)</w:t>
             </w:r>
           </w:p>
@@ -6261,7 +7078,10 @@
               <w:t xml:space="preserve">Mutex&lt;Option&lt;VaultSession&gt;&gt;</w:t>
             </w:r>
             <w:r>
-              <w:t xml:space="preserve">), auto-lock по таймауту (</w:t>
+              <w:t xml:space="preserve">), auto-lock по таймауту (фронтенд</w:t>
+            </w:r>
+            <w:r>
+              <w:t xml:space="preserve"> </w:t>
             </w:r>
             <w:r>
               <w:rPr>
@@ -6270,7 +7090,22 @@
               <w:t xml:space="preserve">src/hooks/useAutoLock.ts</w:t>
             </w:r>
             <w:r>
-              <w:t xml:space="preserve">) и при сворачивании в трей</w:t>
+              <w:t xml:space="preserve"> </w:t>
+            </w:r>
+            <w:r>
+              <w:t xml:space="preserve">+ бэкенд-</w:t>
+            </w:r>
+            <w:r>
+              <w:rPr>
+                <w:rStyle w:val="VerbatimChar"/>
+              </w:rPr>
+              <w:t xml:space="preserve">enforce_autolock</w:t>
+            </w:r>
+            <w:r>
+              <w:t xml:space="preserve"> </w:t>
+            </w:r>
+            <w:r>
+              <w:t xml:space="preserve">на всех секрет-вызовах) и при сворачивании в трей</w:t>
             </w:r>
           </w:p>
         </w:tc>
@@ -6394,7 +7229,7 @@
         </w:numPr>
       </w:pPr>
       <w:r>
-        <w:t xml:space="preserve">Тесты: unit-тесты в</w:t>
+        <w:t xml:space="preserve">Тесты: юнит-тесты ядра в</w:t>
       </w:r>
       <w:r>
         <w:t xml:space="preserve"> </w:t>
@@ -6409,55 +7244,79 @@
         <w:t xml:space="preserve"> </w:t>
       </w:r>
       <w:r>
+        <w:t xml:space="preserve">(включая AAD-привязку и legacy-совместимость),</w:t>
+      </w:r>
+      <w:r>
+        <w:t xml:space="preserve"> </w:t>
+      </w:r>
+      <w:r>
+        <w:rPr>
+          <w:rStyle w:val="VerbatimChar"/>
+        </w:rPr>
+        <w:t xml:space="preserve">src-tauri/src/api.rs</w:t>
+      </w:r>
+      <w:r>
+        <w:t xml:space="preserve"> </w:t>
+      </w:r>
+      <w:r>
+        <w:t xml:space="preserve">(eTLD+1-скоринг) и</w:t>
+      </w:r>
+      <w:r>
+        <w:t xml:space="preserve"> </w:t>
+      </w:r>
+      <w:r>
+        <w:rPr>
+          <w:rStyle w:val="VerbatimChar"/>
+        </w:rPr>
+        <w:t xml:space="preserve">vault/operations.rs</w:t>
+      </w:r>
+      <w:r>
+        <w:t xml:space="preserve"> </w:t>
+      </w:r>
+      <w:r>
         <w:t xml:space="preserve">(</w:t>
       </w:r>
       <w:r>
         <w:rPr>
           <w:rStyle w:val="VerbatimChar"/>
         </w:rPr>
-        <w:t xml:space="preserve">kdf.rs</w:t>
-      </w:r>
-      <w:r>
-        <w:t xml:space="preserve">,</w:t>
-      </w:r>
-      <w:r>
-        <w:t xml:space="preserve"> </w:t>
-      </w:r>
-      <w:r>
-        <w:rPr>
-          <w:rStyle w:val="VerbatimChar"/>
-        </w:rPr>
-        <w:t xml:space="preserve">hkdf.rs</w:t>
-      </w:r>
-      <w:r>
-        <w:t xml:space="preserve"> </w:t>
-      </w:r>
-      <w:r>
-        <w:t xml:space="preserve">и др.) и</w:t>
-      </w:r>
-      <w:r>
-        <w:t xml:space="preserve"> </w:t>
-      </w:r>
-      <w:r>
-        <w:rPr>
-          <w:rStyle w:val="VerbatimChar"/>
-        </w:rPr>
-        <w:t xml:space="preserve">vault/operations.rs</w:t>
-      </w:r>
-      <w:r>
-        <w:t xml:space="preserve"> </w:t>
-      </w:r>
-      <w:r>
-        <w:t xml:space="preserve">(</w:t>
-      </w:r>
-      <w:r>
-        <w:rPr>
-          <w:rStyle w:val="VerbatimChar"/>
-        </w:rPr>
         <w:t xml:space="preserve">cargo test</w:t>
       </w:r>
       <w:r>
-        <w:t xml:space="preserve">); фронтенд-тестов нет.</w:t>
+        <w:t xml:space="preserve">); фронтенд — vitest, 15 тестов (</w:t>
+      </w:r>
+      <w:r>
+        <w:rPr>
+          <w:rStyle w:val="VerbatimChar"/>
+        </w:rPr>
+        <w:t xml:space="preserve">npm test</w:t>
+      </w:r>
+      <w:r>
+        <w:t xml:space="preserve">: safeExternalUrl, шифрование вложений roundtrip/миграция/потеря-ключа, паритет i18n); всё гоняется в CI (</w:t>
+      </w:r>
+      <w:r>
+        <w:rPr>
+          <w:rStyle w:val="VerbatimChar"/>
+        </w:rPr>
+        <w:t xml:space="preserve">security.yml</w:t>
+      </w:r>
+      <w:r>
+        <w:t xml:space="preserve"> </w:t>
+      </w:r>
+      <w:r>
+        <w:t xml:space="preserve">+</w:t>
+      </w:r>
+      <w:r>
+        <w:t xml:space="preserve"> </w:t>
+      </w:r>
+      <w:r>
+        <w:rPr>
+          <w:rStyle w:val="VerbatimChar"/>
+        </w:rPr>
+        <w:t xml:space="preserve">frontend-tests.yml</w:t>
+      </w:r>
+      <w:r>
+        <w:t xml:space="preserve">). Windows-специфичные правки (named pipe, Hello/Passport) требуют smoke-теста на Windows 10/11.</w:t>
       </w:r>
     </w:p>
     <w:p>
@@ -6926,7 +7785,7 @@
         <w:t xml:space="preserve"> </w:t>
       </w:r>
       <w:r>
-        <w:t xml:space="preserve">— биометрическая разблокировка: ключ сессии хранится в Windows Credential Manager и выдаётся только после успешной проверки лица/отпечатка/PIN. Сам мастер-пароль при этом нигде не записывается.</w:t>
+        <w:t xml:space="preserve">— биометрическая разблокировка: ключ сессии хранится в Credential Manager в зашифрованном виде (passport-blob: обёртка из подписи Microsoft Passport — без Hello-промпта обёртку не открыть). Сам мастер-пароль при этом нигде не записывается.</w:t>
       </w:r>
     </w:p>
     <w:p>
@@ -7417,7 +8276,7 @@
               <w:jc w:val="left"/>
             </w:pPr>
             <w:r>
-              <w:t xml:space="preserve">Аутентифицированное шифрование: любое изменение файла = ошибка расшифровки</w:t>
+              <w:t xml:space="preserve">Аутентифицированное шифрование + AAD-привязка ролей: любое изменение файла = ошибка расшифровки; перестановка блоков между сейфами/слоями (трансплантация) — тоже</w:t>
             </w:r>
           </w:p>
         </w:tc>
@@ -7443,7 +8302,171 @@
               <w:jc w:val="left"/>
             </w:pPr>
             <w:r>
-              <w:t xml:space="preserve">Атомарная запись: сначала временный файл, потом мгновенная подмена — хранилище не «побьётся» на половине записи</w:t>
+              <w:t xml:space="preserve">Запись в три шага: временный файл → fsync (переживает сбой питания) → атомарная подмена; предыдущая версия сохраняется в</w:t>
+            </w:r>
+            <w:r>
+              <w:t xml:space="preserve"> </w:t>
+            </w:r>
+            <w:r>
+              <w:rPr>
+                <w:rStyle w:val="VerbatimChar"/>
+              </w:rPr>
+              <w:t xml:space="preserve">.safepass.bak</w:t>
+            </w:r>
+            <w:r>
+              <w:t xml:space="preserve"> </w:t>
+            </w:r>
+            <w:r>
+              <w:t xml:space="preserve">— хранилище не «побьётся» на половине записи и всегда есть откат</w:t>
+            </w:r>
+          </w:p>
+        </w:tc>
+      </w:tr>
+      <w:tr>
+        <w:tc>
+          <w:tcPr/>
+          <w:p>
+            <w:pPr>
+              <w:pStyle w:val="Compact"/>
+              <w:jc w:val="left"/>
+            </w:pPr>
+            <w:r>
+              <w:t xml:space="preserve">Поддельный/повреждённый заголовок KDF</w:t>
+            </w:r>
+          </w:p>
+        </w:tc>
+        <w:tc>
+          <w:tcPr/>
+          <w:p>
+            <w:pPr>
+              <w:pStyle w:val="Compact"/>
+              <w:jc w:val="left"/>
+            </w:pPr>
+            <w:r>
+              <w:t xml:space="preserve">Параметры Argon2id валидируются: приложение вернёт ошибку, а не аварийно завершится</w:t>
+            </w:r>
+          </w:p>
+        </w:tc>
+      </w:tr>
+      <w:tr>
+        <w:tc>
+          <w:tcPr/>
+          <w:p>
+            <w:pPr>
+              <w:pStyle w:val="Compact"/>
+              <w:jc w:val="left"/>
+            </w:pPr>
+            <w:r>
+              <w:t xml:space="preserve">Фишинговые домены (lookalike)</w:t>
+            </w:r>
+          </w:p>
+        </w:tc>
+        <w:tc>
+          <w:tcPr/>
+          <w:p>
+            <w:pPr>
+              <w:pStyle w:val="Compact"/>
+              <w:jc w:val="left"/>
+            </w:pPr>
+            <w:r>
+              <w:t xml:space="preserve">Автозаполнение сопоставляет домены строго по регистрируемому домену (eTLD+1):</w:t>
+            </w:r>
+            <w:r>
+              <w:t xml:space="preserve"> </w:t>
+            </w:r>
+            <w:r>
+              <w:rPr>
+                <w:rStyle w:val="VerbatimChar"/>
+              </w:rPr>
+              <w:t xml:space="preserve">evil-paypal.com</w:t>
+            </w:r>
+            <w:r>
+              <w:t xml:space="preserve"> </w:t>
+            </w:r>
+            <w:r>
+              <w:t xml:space="preserve">и</w:t>
+            </w:r>
+            <w:r>
+              <w:t xml:space="preserve"> </w:t>
+            </w:r>
+            <w:r>
+              <w:rPr>
+                <w:rStyle w:val="VerbatimChar"/>
+              </w:rPr>
+              <w:t xml:space="preserve">paypal.com.evil.io</w:t>
+            </w:r>
+            <w:r>
+              <w:t xml:space="preserve"> </w:t>
+            </w:r>
+            <w:r>
+              <w:t xml:space="preserve">пароль не получают</w:t>
+            </w:r>
+          </w:p>
+        </w:tc>
+      </w:tr>
+      <w:tr>
+        <w:tc>
+          <w:tcPr/>
+          <w:p>
+            <w:pPr>
+              <w:pStyle w:val="Compact"/>
+              <w:jc w:val="left"/>
+            </w:pPr>
+            <w:r>
+              <w:t xml:space="preserve">Перехват локального канала расширения</w:t>
+            </w:r>
+          </w:p>
+        </w:tc>
+        <w:tc>
+          <w:tcPr/>
+          <w:p>
+            <w:pPr>
+              <w:pStyle w:val="Compact"/>
+              <w:jc w:val="left"/>
+            </w:pPr>
+            <w:r>
+              <w:t xml:space="preserve">Канал создаётся с эксклюзивным флагом (первый экземпляр pipe) — чужой процесс не может занять имя</w:t>
+            </w:r>
+            <w:r>
+              <w:t xml:space="preserve"> </w:t>
+            </w:r>
+            <w:r>
+              <w:rPr>
+                <w:rStyle w:val="VerbatimChar"/>
+              </w:rPr>
+              <w:t xml:space="preserve">\\.\pipe\mynx</w:t>
+            </w:r>
+            <w:r>
+              <w:t xml:space="preserve"> </w:t>
+            </w:r>
+            <w:r>
+              <w:t xml:space="preserve">раньше приложения</w:t>
+            </w:r>
+          </w:p>
+        </w:tc>
+      </w:tr>
+      <w:tr>
+        <w:tc>
+          <w:tcPr/>
+          <w:p>
+            <w:pPr>
+              <w:pStyle w:val="Compact"/>
+              <w:jc w:val="left"/>
+            </w:pPr>
+            <w:r>
+              <w:t xml:space="preserve">Оставленная разблокированной после сна системы</w:t>
+            </w:r>
+          </w:p>
+        </w:tc>
+        <w:tc>
+          <w:tcPr/>
+          <w:p>
+            <w:pPr>
+              <w:pStyle w:val="Compact"/>
+              <w:jc w:val="left"/>
+            </w:pPr>
+            <w:r>
+              <w:t xml:space="preserve">Автоблокировка продублирована в бэкенде: даже при обходе интерфейсного таймера любой запрос секретов после простоя вернёт «заблокировано» и сотрёт ключи из памяти</w:t>
             </w:r>
           </w:p>
         </w:tc>
@@ -8548,7 +9571,7 @@
         <w:rFonts w:asciiTheme="minorHAnsi" w:cstheme="minorBidi" w:eastAsiaTheme="minorHAnsi" w:hAnsiTheme="minorHAnsi"/>
         <w:sz w:val="24"/>
         <w:szCs w:val="24"/>
-        <w:lang w:bidi="ar-SA" w:eastAsia="en-US" w:val="en-US"/>
+        <w:lang w:bidi="ar-SA" w:eastAsia="en-US" w:val="ru-RU"/>
       </w:rPr>
     </w:rPrDefault>
     <w:pPrDefault>

</xml_diff>

<commit_message>
fix(native-host): ship mynx-native-host.exe in installer, proper registration (v1.2.3)
- register.reg pointed to the author's personal path (D:\Kimi projects\...)
  and the host manifest to C:\Users\Matt\... with foreign extension IDs:
  native messaging could never work for users
- the NSIS installer never contained mynx-native-host.exe at all:
  add bundle.externalBin sidecar, release workflow builds and stages it
- new register-native-host.ps1: locates the exe, writes the host manifest
  with the user's extension ID in allowed_origins, registers HKCU keys
  for Chrome/Edge/Chromium/Canary (no admin needed); broken register.reg
  and stale manifest template removed
- release assets now include standalone mynx-native-host.exe
- version 1.2.3, CHANGELOG/README/USER-GUIDE updated
</commit_message>
<xml_diff>
--- a/docs/tech-stack.docx
+++ b/docs/tech-stack.docx
@@ -2,6 +2,32 @@
 <file path=word/document.xml><?xml version="1.0" encoding="utf-8"?>
 <w:document xmlns:w="http://schemas.openxmlformats.org/wordprocessingml/2006/main" xmlns:m="http://schemas.openxmlformats.org/officeDocument/2006/math" xmlns:r="http://schemas.openxmlformats.org/officeDocument/2006/relationships" xmlns:o="urn:schemas-microsoft-com:office:office" xmlns:v="urn:schemas-microsoft-com:vml" xmlns:w10="urn:schemas-microsoft-com:office:word" xmlns:a="http://schemas.openxmlformats.org/drawingml/2006/main" xmlns:pic="http://schemas.openxmlformats.org/drawingml/2006/picture" xmlns:wp="http://schemas.openxmlformats.org/drawingml/2006/wordprocessingDrawing">
   <w:body>
+    <w:sdt>
+      <w:sdtPr>
+        <w:docPartObj>
+          <w:docPartGallery w:val="Table of Contents"/>
+          <w:docPartUnique/>
+        </w:docPartObj>
+      </w:sdtPr>
+      <w:sdtContent>
+        <w:p>
+          <w:pPr>
+            <w:pStyle w:val="TOCHeading"/>
+          </w:pPr>
+          <w:r>
+            <w:t xml:space="preserve">Table of Contents</w:t>
+          </w:r>
+        </w:p>
+        <w:p>
+          <w:r>
+            <w:fldChar w:fldCharType="begin" w:dirty="true"/>
+            <w:instrText xml:space="preserve">TOC \o "1-2" \h \z \u</w:instrText>
+            <w:fldChar w:fldCharType="separate"/>
+            <w:fldChar w:fldCharType="end"/>
+          </w:r>
+        </w:p>
+      </w:sdtContent>
+    </w:sdt>
     <w:bookmarkStart w:id="40" w:name="mynx--стек-и-технологии"/>
     <w:p>
       <w:pPr>

</xml_diff>